<commit_message>
Add Expert P follow-up: game judged suitable for FRA, HK under-assessment context, entry-vs-retention reconciliation
Follow-up closes the game-reaction and FRA-practice gaps. The apparent tension between 'abandonment is not tech difficulty' and 'difficult to use, never come back' is recorded as a two-stage reading (entry vs retention), kept distinct as researcher's analysis. Attribution question remains unasked — caution stands.

Co-Authored-By: Claude Fable 5 <noreply@anthropic.com>
Claude-Session: https://claude.ai/code/session_01KoT3i8geZspYBMMKVYJUTG
</commit_message>
<xml_diff>
--- a/docs/thesis/expert_panel/Expert_Interview_Summary_ExpertP_Physio_DRAFT.docx
+++ b/docs/thesis/expert_panel/Expert_Interview_Summary_ExpertP_Physio_DRAFT.docx
@@ -73,6 +73,9 @@
         </w:rPr>
         <w:t>Interview: March 2026 (the first of the four expert consultations), by telephone, approximately 25 minutes, in Cantonese mixed with English; the researcher's written notes are the primary record; quotations below are the researcher's English renderings. Consent: signed form received 4 August 2026 — all nine statements initialled, participant signature dated 4/8/2026, researcher countersigned; identification preference: anonymous/pseudonymous (named attribution refused). Under the programme's dual-dating rule the record states both dates: interview March 2026; written consent 4 August 2026, obtained retrospectively. Anonymised quotation is permitted (statement 8 initialled).</w:t>
       </w:r>
+      <w:r>
+        <w:t xml:space="preserve"> A short follow-up conversation was held in early August 2026 [exact date and mode to confirm — presumed telephone] to close gaps identified in review; it is recorded in section 3A below and covered by the same consent.</w:t>
+      </w:r>
     </w:p>
     <w:p>
       <w:pPr>
@@ -143,6 +146,34 @@
         <w:pStyle w:val="Heading1"/>
       </w:pPr>
       <w:r>
+        <w:t>3A. Follow-up interview (early August 2026)</w:t>
+      </w:r>
+    </w:p>
+    <w:p>
+      <w:r>
+        <w:t>3A.1 Reaction to the actual game. Expert P was asked to play the study's skiing coordination game. His judgement: the game is suitable for FRA; and if it were installed in the (FRA) system he would come back to play it regularly. This is the panel physiotherapist's direct assessment of the artifact itself — and his stated regular-return intention mirrors the study's D2 intention construct.</w:t>
+      </w:r>
+    </w:p>
+    <w:p>
+      <w:r>
+        <w:t>3A.2 Fall-risk assessment in Hong Kong. FRA is critical for elderly people, yet Hong Kong does not conduct this assessment regularly, because the community does not see its importance. Advertising and promotion may play a part, but lack of reference and difficulty of use could be a key reason. He also restated a point from the original interview that the researcher had not previously recorded: health technology must be easy to use, otherwise it is very difficult to promote — alongside economic factors such as pricing and professional fees.</w:t>
+      </w:r>
+    </w:p>
+    <w:p>
+      <w:r>
+        <w:t>3A.3 Restatement on failure and complexity. Elderly people are not used to failing when practising with health technology — balance checking, for example, is a complicated system, so very few elderly people are willing to join the assessment at all. Among those who do try, finding the technology difficult to use, or slow to show improvement, leads to lost interest and engagement — and they never come back. This is very common where the procedure starts complicated.</w:t>
+      </w:r>
+    </w:p>
+    <w:p>
+      <w:r>
+        <w:t>Reconciliation note (researcher's analysis, kept distinct from Expert P's words): 3A.2-3A.3 nuance the original statement 3.2 that abandonment is "mostly not the difficulty of the health tech". Read together, his account is two-staged: difficulty and complexity act at ENTRY (they deter joining and can end engagement in the first encounters), while reward scarcity and slow visible progress drive abandonment among those who have engaged. Both statements are preserved verbatim above; the two-stage reading is the researcher's.</w:t>
+      </w:r>
+    </w:p>
+    <w:p>
+      <w:pPr>
+        <w:pStyle w:val="Heading1"/>
+      </w:pPr>
+      <w:r>
         <w:t>4. Relation to the thesis</w:t>
       </w:r>
     </w:p>
@@ -152,6 +183,9 @@
           <w:i w:val="0"/>
         </w:rPr>
         <w:t>(a) FIDS timing (§5.5): the two-week-to-two-month abandonment window from an independent clinical caseload converges with the programme's observed early-disengagement timing. (b) Attribution (§5.6, §8.5): abandonment is not driven by technology difficulty — reward scarcity, slow visible progress and hopelessness about improvement dominate; the aging-and-mortality component enriches the FIAS self-concept mechanism. (c) The avoided middle (§8.6B, Figure 8.1): balance, fall-risk and cognitive assessment cannot be simplified away — supporting the thesis argument that the measuring middle ground must be made bearable rather than avoided. (d) Design implications (§7.5): the infantilisation warning and the observed-failure/ego effect support adult-calibrated challenge and private, unsupervised play — the Stage-3 deployment choice — and add a social-exposure moderator to the failure mechanism. (e) Demographic convergence: his educated/financially-comfortable adopter profile matches the fourth consultation's independent account, and his reward-contradiction sharpens the adaptive-learning framework's calibration problem. As with the whole panel, these views are interpretation and practice validation; they are not additional empirical evidence and do not substitute for sample size.</w:t>
+      </w:r>
+      <w:r>
+        <w:t xml:space="preserve"> (f) From the follow-up: the panel physiotherapist judged the actual game suitable for FRA and stated a regular-return intention — the strongest artifact-level validation in the panel record, though a single expert judgement, not user evidence. (g) His account of Hong Kong's irregular fall-risk assessment (importance not perceived; ease-of-use and promotion barriers) strengthens the thesis's problem statement from local practice. (h) The entry-versus-retention two-stage reading (3A note) maps onto the programme's FIDS/FIAS distinction: ease-of-use governs whether engagement begins; reward and visible progress govern whether it survives.</w:t>
       </w:r>
     </w:p>
     <w:p>

</xml_diff>

<commit_message>
Date the Wong follow-up: 5 August 2026, by telephone
Co-Authored-By: Claude Fable 5 <noreply@anthropic.com>
Claude-Session: https://claude.ai/code/session_01KoT3i8geZspYBMMKVYJUTG
</commit_message>
<xml_diff>
--- a/docs/thesis/expert_panel/Expert_Interview_Summary_ExpertP_Physio_DRAFT.docx
+++ b/docs/thesis/expert_panel/Expert_Interview_Summary_ExpertP_Physio_DRAFT.docx
@@ -74,7 +74,7 @@
         <w:t>Interview: March 2026 (the first of the four expert consultations), by telephone, approximately 25 minutes, in Cantonese mixed with English; the researcher's written notes are the primary record; quotations below are the researcher's English renderings. Consent: signed form received 4 August 2026 — all nine statements initialled, participant signature dated 4/8/2026, researcher countersigned; identification preference: anonymous/pseudonymous (named attribution refused). Under the programme's dual-dating rule the record states both dates: interview March 2026; written consent 4 August 2026, obtained retrospectively. Anonymised quotation is permitted (statement 8 initialled).</w:t>
       </w:r>
       <w:r>
-        <w:t xml:space="preserve"> A short follow-up conversation was held in early August 2026 [exact date and mode to confirm — presumed telephone] to close gaps identified in review; it is recorded in section 3A below and covered by the same consent.</w:t>
+        <w:t xml:space="preserve"> A short follow-up conversation was held on 5 August 2026, by telephone to close gaps identified in review; it is recorded in section 3A below and covered by the same consent.</w:t>
       </w:r>
     </w:p>
     <w:p>
@@ -146,7 +146,7 @@
         <w:pStyle w:val="Heading1"/>
       </w:pPr>
       <w:r>
-        <w:t>3A. Follow-up interview (early August 2026)</w:t>
+        <w:t>3A. Follow-up interview (5 August 2026)</w:t>
       </w:r>
     </w:p>
     <w:p>

</xml_diff>